<commit_message>
add githublink in the report corver
</commit_message>
<xml_diff>
--- a/report/report.docx
+++ b/report/report.docx
@@ -265,98 +265,139 @@
     <w:p>
       <w:pPr>
         <w:rPr>
-          <w:rFonts w:hint="default" w:ascii="Times New Roman" w:hAnsi="Times New Roman" w:cs="Times New Roman"/>
-          <w:b/>
-          <w:bCs/>
-          <w:sz w:val="24"/>
-          <w:szCs w:val="32"/>
-          <w:lang w:val="en-US" w:eastAsia="zh-CN"/>
-        </w:rPr>
-      </w:pPr>
-    </w:p>
-    <w:p>
-      <w:pPr>
-        <w:rPr>
-          <w:rFonts w:hint="default" w:ascii="Times New Roman" w:hAnsi="Times New Roman" w:cs="Times New Roman"/>
-          <w:b/>
-          <w:bCs/>
-          <w:sz w:val="24"/>
-          <w:szCs w:val="32"/>
-          <w:lang w:val="en-US" w:eastAsia="zh-CN"/>
-        </w:rPr>
-      </w:pPr>
-    </w:p>
-    <w:p>
-      <w:pPr>
-        <w:rPr>
-          <w:rFonts w:hint="default" w:ascii="Times New Roman" w:hAnsi="Times New Roman" w:cs="Times New Roman"/>
-          <w:b/>
-          <w:bCs/>
-          <w:sz w:val="24"/>
-          <w:szCs w:val="32"/>
-          <w:lang w:val="en-US" w:eastAsia="zh-CN"/>
-        </w:rPr>
-      </w:pPr>
-    </w:p>
-    <w:p>
-      <w:pPr>
-        <w:rPr>
-          <w:rFonts w:hint="default" w:ascii="Times New Roman" w:hAnsi="Times New Roman" w:cs="Times New Roman"/>
-          <w:b/>
-          <w:bCs/>
-          <w:sz w:val="24"/>
-          <w:szCs w:val="32"/>
-          <w:lang w:val="en-US" w:eastAsia="zh-CN"/>
-        </w:rPr>
-      </w:pPr>
-    </w:p>
-    <w:p>
-      <w:pPr>
-        <w:rPr>
-          <w:rFonts w:hint="default" w:ascii="Times New Roman" w:hAnsi="Times New Roman" w:cs="Times New Roman"/>
-          <w:b/>
-          <w:bCs/>
-          <w:sz w:val="24"/>
-          <w:szCs w:val="32"/>
-          <w:lang w:val="en-US" w:eastAsia="zh-CN"/>
-        </w:rPr>
-      </w:pPr>
-    </w:p>
-    <w:p>
-      <w:pPr>
-        <w:rPr>
-          <w:rFonts w:hint="default" w:ascii="Times New Roman" w:hAnsi="Times New Roman" w:cs="Times New Roman"/>
-          <w:b/>
-          <w:bCs/>
-          <w:sz w:val="24"/>
-          <w:szCs w:val="32"/>
-          <w:lang w:val="en-US" w:eastAsia="zh-CN"/>
-        </w:rPr>
-      </w:pPr>
-    </w:p>
-    <w:p>
-      <w:pPr>
-        <w:rPr>
-          <w:rFonts w:hint="default" w:ascii="Times New Roman" w:hAnsi="Times New Roman" w:cs="Times New Roman"/>
-          <w:b/>
-          <w:bCs/>
-          <w:sz w:val="24"/>
-          <w:szCs w:val="32"/>
-          <w:lang w:val="en-US" w:eastAsia="zh-CN"/>
-        </w:rPr>
-      </w:pPr>
-    </w:p>
-    <w:p>
-      <w:pPr>
-        <w:rPr>
-          <w:rFonts w:hint="default" w:ascii="Times New Roman" w:hAnsi="Times New Roman" w:cs="Times New Roman"/>
-          <w:b/>
-          <w:bCs/>
-          <w:sz w:val="24"/>
-          <w:szCs w:val="32"/>
-          <w:lang w:val="en-US" w:eastAsia="zh-CN"/>
-        </w:rPr>
-      </w:pPr>
+          <w:rFonts w:hint="eastAsia" w:ascii="Times New Roman" w:hAnsi="Times New Roman" w:cs="Times New Roman"/>
+          <w:b/>
+          <w:bCs/>
+          <w:lang w:val="en-US" w:eastAsia="zh-CN"/>
+        </w:rPr>
+      </w:pPr>
+    </w:p>
+    <w:p>
+      <w:pPr>
+        <w:rPr>
+          <w:rFonts w:hint="eastAsia" w:ascii="Times New Roman" w:hAnsi="Times New Roman" w:cs="Times New Roman"/>
+          <w:b/>
+          <w:bCs/>
+          <w:lang w:val="en-US" w:eastAsia="zh-CN"/>
+        </w:rPr>
+      </w:pPr>
+    </w:p>
+    <w:p>
+      <w:pPr>
+        <w:rPr>
+          <w:rFonts w:hint="eastAsia" w:ascii="Times New Roman" w:hAnsi="Times New Roman" w:cs="Times New Roman"/>
+          <w:b/>
+          <w:bCs/>
+          <w:lang w:val="en-US" w:eastAsia="zh-CN"/>
+        </w:rPr>
+      </w:pPr>
+    </w:p>
+    <w:p>
+      <w:pPr>
+        <w:rPr>
+          <w:rFonts w:hint="eastAsia" w:ascii="Times New Roman" w:hAnsi="Times New Roman" w:cs="Times New Roman"/>
+          <w:b/>
+          <w:bCs/>
+          <w:lang w:val="en-US" w:eastAsia="zh-CN"/>
+        </w:rPr>
+      </w:pPr>
+    </w:p>
+    <w:p>
+      <w:pPr>
+        <w:rPr>
+          <w:rFonts w:hint="eastAsia" w:ascii="Times New Roman" w:hAnsi="Times New Roman" w:cs="Times New Roman"/>
+          <w:b/>
+          <w:bCs/>
+          <w:lang w:val="en-US" w:eastAsia="zh-CN"/>
+        </w:rPr>
+      </w:pPr>
+    </w:p>
+    <w:p>
+      <w:pPr>
+        <w:rPr>
+          <w:rFonts w:hint="eastAsia" w:ascii="Times New Roman" w:hAnsi="Times New Roman" w:cs="Times New Roman"/>
+          <w:b/>
+          <w:bCs/>
+          <w:lang w:val="en-US" w:eastAsia="zh-CN"/>
+        </w:rPr>
+      </w:pPr>
+    </w:p>
+    <w:p>
+      <w:pPr>
+        <w:jc w:val="center"/>
+        <w:rPr>
+          <w:rFonts w:hint="eastAsia" w:ascii="Times New Roman" w:hAnsi="Times New Roman" w:cs="Times New Roman"/>
+          <w:b/>
+          <w:bCs/>
+          <w:lang w:val="en-US" w:eastAsia="zh-CN"/>
+        </w:rPr>
+      </w:pPr>
+    </w:p>
+    <w:p>
+      <w:pPr>
+        <w:jc w:val="center"/>
+        <w:rPr>
+          <w:rFonts w:hint="default" w:ascii="Times New Roman" w:hAnsi="Times New Roman" w:cs="Times New Roman"/>
+          <w:b w:val="0"/>
+          <w:bCs w:val="0"/>
+          <w:lang w:val="en-US" w:eastAsia="zh-CN"/>
+        </w:rPr>
+      </w:pPr>
+      <w:r>
+        <w:rPr>
+          <w:rFonts w:hint="eastAsia" w:ascii="Times New Roman" w:hAnsi="Times New Roman" w:cs="Times New Roman"/>
+          <w:b/>
+          <w:bCs/>
+          <w:lang w:val="en-US" w:eastAsia="zh-CN"/>
+        </w:rPr>
+        <w:t xml:space="preserve">Github Link: </w:t>
+      </w:r>
+      <w:r>
+        <w:rPr>
+          <w:rFonts w:hint="default" w:ascii="Times New Roman" w:hAnsi="Times New Roman" w:cs="Times New Roman"/>
+          <w:b w:val="0"/>
+          <w:bCs w:val="0"/>
+          <w:lang w:val="en-US" w:eastAsia="zh-CN"/>
+        </w:rPr>
+        <w:fldChar w:fldCharType="begin"/>
+      </w:r>
+      <w:r>
+        <w:rPr>
+          <w:rFonts w:hint="default" w:ascii="Times New Roman" w:hAnsi="Times New Roman" w:cs="Times New Roman"/>
+          <w:b w:val="0"/>
+          <w:bCs w:val="0"/>
+          <w:lang w:val="en-US" w:eastAsia="zh-CN"/>
+        </w:rPr>
+        <w:instrText xml:space="preserve"> HYPERLINK "https://github.com/Try1ng1ng/2322Project.git" </w:instrText>
+      </w:r>
+      <w:r>
+        <w:rPr>
+          <w:rFonts w:hint="default" w:ascii="Times New Roman" w:hAnsi="Times New Roman" w:cs="Times New Roman"/>
+          <w:b w:val="0"/>
+          <w:bCs w:val="0"/>
+          <w:lang w:val="en-US" w:eastAsia="zh-CN"/>
+        </w:rPr>
+        <w:fldChar w:fldCharType="separate"/>
+      </w:r>
+      <w:r>
+        <w:rPr>
+          <w:rStyle w:val="4"/>
+          <w:rFonts w:hint="default" w:ascii="Times New Roman" w:hAnsi="Times New Roman" w:cs="Times New Roman"/>
+          <w:b w:val="0"/>
+          <w:bCs w:val="0"/>
+          <w:lang w:val="en-US" w:eastAsia="zh-CN"/>
+        </w:rPr>
+        <w:t>https://github.com/Try1ng1ng/2322Project.git</w:t>
+      </w:r>
+      <w:r>
+        <w:rPr>
+          <w:rFonts w:hint="default" w:ascii="Times New Roman" w:hAnsi="Times New Roman" w:cs="Times New Roman"/>
+          <w:b w:val="0"/>
+          <w:bCs w:val="0"/>
+          <w:lang w:val="en-US" w:eastAsia="zh-CN"/>
+        </w:rPr>
+        <w:fldChar w:fldCharType="end"/>
+      </w:r>
     </w:p>
     <w:p>
       <w:pPr>
@@ -1261,6 +1302,7 @@
           <w:rFonts w:hint="default" w:ascii="Times New Roman" w:hAnsi="Times New Roman" w:cs="Times New Roman"/>
         </w:rPr>
       </w:pPr>
+      <w:bookmarkStart w:id="0" w:name="_GoBack"/>
       <w:r>
         <w:rPr>
           <w:rFonts w:hint="default" w:ascii="Times New Roman" w:hAnsi="Times New Roman" w:cs="Times New Roman"/>
@@ -1308,6 +1350,7 @@
         </w:drawing>
       </w:r>
     </w:p>
+    <w:bookmarkEnd w:id="0"/>
     <w:p>
       <w:pPr>
         <w:widowControl w:val="0"/>
@@ -2985,16 +3028,7 @@
           <w:bCs/>
           <w:lang w:val="en-US" w:eastAsia="zh-CN"/>
         </w:rPr>
-        <w:t>5</w:t>
-      </w:r>
-      <w:r>
-        <w:rPr>
-          <w:rFonts w:hint="eastAsia" w:ascii="Times New Roman" w:hAnsi="Times New Roman" w:cs="Times New Roman"/>
-          <w:b/>
-          <w:bCs/>
-          <w:lang w:val="en-US" w:eastAsia="zh-CN"/>
-        </w:rPr>
-        <w:t>. Github Link</w:t>
+        <w:t>5. Github Link</w:t>
       </w:r>
     </w:p>
     <w:p>
@@ -3052,8 +3086,6 @@
         </w:rPr>
         <w:fldChar w:fldCharType="end"/>
       </w:r>
-      <w:bookmarkStart w:id="0" w:name="_GoBack"/>
-      <w:bookmarkEnd w:id="0"/>
     </w:p>
     <w:sectPr>
       <w:pgSz w:w="11906" w:h="16838"/>
@@ -3179,7 +3211,7 @@
     <w:lsdException w:unhideWhenUsed="0" w:uiPriority="0" w:semiHidden="0" w:name="HTML Sample"/>
     <w:lsdException w:unhideWhenUsed="0" w:uiPriority="0" w:semiHidden="0" w:name="HTML Typewriter"/>
     <w:lsdException w:unhideWhenUsed="0" w:uiPriority="0" w:semiHidden="0" w:name="HTML Variable"/>
-    <w:lsdException w:unhideWhenUsed="0" w:uiPriority="0" w:name="Normal Table"/>
+    <w:lsdException w:qFormat="1" w:unhideWhenUsed="0" w:uiPriority="0" w:name="Normal Table"/>
     <w:lsdException w:unhideWhenUsed="0" w:uiPriority="0" w:semiHidden="0" w:name="annotation subject"/>
     <w:lsdException w:unhideWhenUsed="0" w:uiPriority="0" w:semiHidden="0" w:name="Table Simple 1"/>
     <w:lsdException w:unhideWhenUsed="0" w:uiPriority="0" w:semiHidden="0" w:name="Table Simple 2"/>
@@ -3350,6 +3382,7 @@
   <w:style w:type="table" w:default="1" w:styleId="2">
     <w:name w:val="Normal Table"/>
     <w:semiHidden/>
+    <w:qFormat/>
     <w:uiPriority w:val="0"/>
     <w:tblPr>
       <w:tblCellMar>

</xml_diff>